<commit_message>
implemented product variation in direct checkout
</commit_message>
<xml_diff>
--- a/OneSkyShop_ProjectPlan.docx
+++ b/OneSkyShop_ProjectPlan.docx
@@ -2073,8 +2073,6 @@
       <w:r>
         <w:t>Return &amp; Refund Policy</w:t>
       </w:r>
-      <w:bookmarkStart w:id="1" w:name="_GoBack"/>
-      <w:bookmarkEnd w:id="1"/>
     </w:p>
     <w:p>
       <w:pPr>
@@ -2274,15 +2272,156 @@
     <w:p>
       <w:pPr>
         <w:pStyle w:val="NormalWeb"/>
-        <w:numPr>
-          <w:ilvl w:val="0"/>
-          <w:numId w:val="15"/>
-        </w:numPr>
         <w:shd w:val="clear" w:color="auto" w:fill="FFFFFF" w:themeFill="background1"/>
+        <w:ind w:left="720"/>
         <w:rPr>
           <w:color w:val="000000" w:themeColor="text1"/>
         </w:rPr>
       </w:pPr>
+      <w:r>
+        <w:rPr>
+          <w:color w:val="000000" w:themeColor="text1"/>
+        </w:rPr>
+        <w:t>pant - 28-38</w:t>
+      </w:r>
+      <w:r>
+        <w:rPr>
+          <w:color w:val="000000" w:themeColor="text1"/>
+        </w:rPr>
+        <w:br/>
+      </w:r>
+      <w:r>
+        <w:rPr>
+          <w:color w:val="000000" w:themeColor="text1"/>
+        </w:rPr>
+        <w:t>shirt - M, L , XL , XXL</w:t>
+      </w:r>
+      <w:r>
+        <w:rPr>
+          <w:color w:val="000000" w:themeColor="text1"/>
+        </w:rPr>
+        <w:br/>
+      </w:r>
+      <w:r>
+        <w:rPr>
+          <w:color w:val="000000" w:themeColor="text1"/>
+        </w:rPr>
+        <w:t xml:space="preserve">when a </w:t>
+      </w:r>
+      <w:proofErr w:type="spellStart"/>
+      <w:r>
+        <w:rPr>
+          <w:color w:val="000000" w:themeColor="text1"/>
+        </w:rPr>
+        <w:t>varity</w:t>
+      </w:r>
+      <w:proofErr w:type="spellEnd"/>
+      <w:r>
+        <w:rPr>
+          <w:color w:val="000000" w:themeColor="text1"/>
+        </w:rPr>
+        <w:t xml:space="preserve"> is not available it will be disabled in frontend</w:t>
+      </w:r>
+      <w:r>
+        <w:rPr>
+          <w:color w:val="000000" w:themeColor="text1"/>
+        </w:rPr>
+        <w:br/>
+      </w:r>
+      <w:r>
+        <w:rPr>
+          <w:color w:val="000000" w:themeColor="text1"/>
+        </w:rPr>
+        <w:t xml:space="preserve">product details - click to zoom </w:t>
+      </w:r>
+      <w:r>
+        <w:rPr>
+          <w:color w:val="000000" w:themeColor="text1"/>
+        </w:rPr>
+        <w:br/>
+      </w:r>
+      <w:r>
+        <w:rPr>
+          <w:color w:val="000000" w:themeColor="text1"/>
+        </w:rPr>
+        <w:t xml:space="preserve">product details - order on </w:t>
+      </w:r>
+      <w:proofErr w:type="spellStart"/>
+      <w:r>
+        <w:rPr>
+          <w:color w:val="000000" w:themeColor="text1"/>
+        </w:rPr>
+        <w:t>Whatsapp</w:t>
+      </w:r>
+      <w:proofErr w:type="spellEnd"/>
+      <w:r>
+        <w:rPr>
+          <w:color w:val="000000" w:themeColor="text1"/>
+        </w:rPr>
+        <w:t xml:space="preserve"> button</w:t>
+      </w:r>
+      <w:r>
+        <w:rPr>
+          <w:color w:val="000000" w:themeColor="text1"/>
+        </w:rPr>
+        <w:br/>
+      </w:r>
+      <w:r>
+        <w:rPr>
+          <w:color w:val="000000" w:themeColor="text1"/>
+        </w:rPr>
+        <w:t xml:space="preserve">Footer  - </w:t>
+      </w:r>
+      <w:proofErr w:type="spellStart"/>
+      <w:r>
+        <w:rPr>
+          <w:color w:val="000000" w:themeColor="text1"/>
+        </w:rPr>
+        <w:t>belivers</w:t>
+      </w:r>
+      <w:proofErr w:type="spellEnd"/>
+      <w:r>
+        <w:rPr>
+          <w:color w:val="000000" w:themeColor="text1"/>
+        </w:rPr>
+        <w:t xml:space="preserve"> sign + </w:t>
+      </w:r>
+      <w:proofErr w:type="spellStart"/>
+      <w:r>
+        <w:rPr>
+          <w:color w:val="000000" w:themeColor="text1"/>
+        </w:rPr>
+        <w:t>oubd</w:t>
+      </w:r>
+      <w:proofErr w:type="spellEnd"/>
+      <w:r>
+        <w:rPr>
+          <w:color w:val="000000" w:themeColor="text1"/>
+        </w:rPr>
+        <w:br/>
+      </w:r>
+      <w:bookmarkStart w:id="1" w:name="_GoBack"/>
+      <w:bookmarkEnd w:id="1"/>
+      <w:r>
+        <w:rPr>
+          <w:color w:val="000000" w:themeColor="text1"/>
+        </w:rPr>
+        <w:t xml:space="preserve">top to bottom  -- &amp; OR -- </w:t>
+      </w:r>
+      <w:proofErr w:type="spellStart"/>
+      <w:r>
+        <w:rPr>
+          <w:color w:val="000000" w:themeColor="text1"/>
+        </w:rPr>
+        <w:t>Whatsapp</w:t>
+      </w:r>
+      <w:proofErr w:type="spellEnd"/>
+      <w:r>
+        <w:rPr>
+          <w:color w:val="000000" w:themeColor="text1"/>
+        </w:rPr>
+        <w:t xml:space="preserve"> | call | fb msg</w:t>
+      </w:r>
     </w:p>
     <w:sectPr>
       <w:pgSz w:w="12240" w:h="15840"/>
@@ -14975,7 +15114,7 @@
 </file>
 
 <file path=customXml/itemProps1.xml><?xml version="1.0" encoding="utf-8"?>
-<ds:datastoreItem xmlns:ds="http://schemas.openxmlformats.org/officeDocument/2006/customXml" ds:itemID="{EC96C12C-2FB1-4114-8620-A5610B216AC6}">
+<ds:datastoreItem xmlns:ds="http://schemas.openxmlformats.org/officeDocument/2006/customXml" ds:itemID="{6740484F-0689-4664-9493-8AEA6D99BE77}">
   <ds:schemaRefs>
     <ds:schemaRef ds:uri="http://schemas.openxmlformats.org/officeDocument/2006/bibliography"/>
   </ds:schemaRefs>

</xml_diff>

<commit_message>
navbar, category, subcategory updated
</commit_message>
<xml_diff>
--- a/OneSkyShop_ProjectPlan.docx
+++ b/OneSkyShop_ProjectPlan.docx
@@ -2278,144 +2278,289 @@
           <w:color w:val="000000" w:themeColor="text1"/>
         </w:rPr>
       </w:pPr>
-      <w:r>
+    </w:p>
+    <w:p>
+      <w:pPr>
+        <w:pStyle w:val="NormalWeb"/>
+        <w:numPr>
+          <w:ilvl w:val="0"/>
+          <w:numId w:val="15"/>
+        </w:numPr>
+        <w:shd w:val="clear" w:color="auto" w:fill="FFFFFF" w:themeFill="background1"/>
         <w:rPr>
           <w:color w:val="000000" w:themeColor="text1"/>
         </w:rPr>
-        <w:t>pant - 28-38</w:t>
-      </w:r>
+      </w:pPr>
       <w:r>
         <w:rPr>
           <w:color w:val="000000" w:themeColor="text1"/>
         </w:rPr>
+        <w:t>Add to cart &gt; modal &gt; select variety &gt; place in cart</w:t>
+      </w:r>
+      <w:r>
+        <w:rPr>
+          <w:color w:val="000000" w:themeColor="text1"/>
+        </w:rPr>
         <w:br/>
       </w:r>
-      <w:r>
+    </w:p>
+    <w:p>
+      <w:pPr>
+        <w:pStyle w:val="NormalWeb"/>
+        <w:numPr>
+          <w:ilvl w:val="0"/>
+          <w:numId w:val="15"/>
+        </w:numPr>
+        <w:shd w:val="clear" w:color="auto" w:fill="FFFFFF" w:themeFill="background1"/>
         <w:rPr>
           <w:color w:val="000000" w:themeColor="text1"/>
         </w:rPr>
-        <w:t>shirt - M, L , XL , XXL</w:t>
-      </w:r>
+      </w:pPr>
       <w:r>
         <w:rPr>
           <w:color w:val="000000" w:themeColor="text1"/>
         </w:rPr>
+        <w:t>Sub category</w:t>
+      </w:r>
+      <w:r>
+        <w:rPr>
+          <w:color w:val="000000" w:themeColor="text1"/>
+        </w:rPr>
         <w:br/>
       </w:r>
-      <w:r>
+    </w:p>
+    <w:p>
+      <w:pPr>
+        <w:pStyle w:val="NormalWeb"/>
+        <w:numPr>
+          <w:ilvl w:val="0"/>
+          <w:numId w:val="15"/>
+        </w:numPr>
+        <w:shd w:val="clear" w:color="auto" w:fill="FFFFFF" w:themeFill="background1"/>
         <w:rPr>
           <w:color w:val="000000" w:themeColor="text1"/>
         </w:rPr>
-        <w:t xml:space="preserve">when a </w:t>
+      </w:pPr>
+      <w:r>
+        <w:rPr>
+          <w:color w:val="000000" w:themeColor="text1"/>
+        </w:rPr>
+        <w:t>Customer location dropdown, delivery charge dynamic (</w:t>
       </w:r>
       <w:proofErr w:type="spellStart"/>
       <w:r>
         <w:rPr>
           <w:color w:val="000000" w:themeColor="text1"/>
         </w:rPr>
-        <w:t>varity</w:t>
+        <w:t>belivers</w:t>
       </w:r>
       <w:proofErr w:type="spellEnd"/>
       <w:r>
         <w:rPr>
           <w:color w:val="000000" w:themeColor="text1"/>
         </w:rPr>
-        <w:t xml:space="preserve"> is not available it will be disabled in frontend</w:t>
-      </w:r>
+        <w:t xml:space="preserve"> sign + </w:t>
+      </w:r>
+      <w:proofErr w:type="spellStart"/>
       <w:r>
         <w:rPr>
           <w:color w:val="000000" w:themeColor="text1"/>
         </w:rPr>
-        <w:br/>
-      </w:r>
+        <w:t>oubd</w:t>
+      </w:r>
+      <w:proofErr w:type="spellEnd"/>
       <w:r>
         <w:rPr>
           <w:color w:val="000000" w:themeColor="text1"/>
         </w:rPr>
-        <w:t xml:space="preserve">product details - click to zoom </w:t>
-      </w:r>
-      <w:r>
+        <w:t>)</w:t>
+      </w:r>
+    </w:p>
+    <w:p>
+      <w:pPr>
         <w:rPr>
           <w:color w:val="000000" w:themeColor="text1"/>
         </w:rPr>
-        <w:br/>
-      </w:r>
-      <w:r>
-        <w:rPr>
-          <w:color w:val="000000" w:themeColor="text1"/>
-        </w:rPr>
-        <w:t xml:space="preserve">product details - order on </w:t>
-      </w:r>
-      <w:proofErr w:type="spellStart"/>
-      <w:r>
-        <w:rPr>
-          <w:color w:val="000000" w:themeColor="text1"/>
-        </w:rPr>
-        <w:t>Whatsapp</w:t>
-      </w:r>
-      <w:proofErr w:type="spellEnd"/>
-      <w:r>
-        <w:rPr>
-          <w:color w:val="000000" w:themeColor="text1"/>
-        </w:rPr>
-        <w:t xml:space="preserve"> button</w:t>
-      </w:r>
-      <w:r>
-        <w:rPr>
-          <w:color w:val="000000" w:themeColor="text1"/>
-        </w:rPr>
-        <w:br/>
-      </w:r>
-      <w:r>
-        <w:rPr>
-          <w:color w:val="000000" w:themeColor="text1"/>
-        </w:rPr>
-        <w:t xml:space="preserve">Footer  - </w:t>
-      </w:r>
-      <w:proofErr w:type="spellStart"/>
-      <w:r>
-        <w:rPr>
-          <w:color w:val="000000" w:themeColor="text1"/>
-        </w:rPr>
-        <w:t>belivers</w:t>
-      </w:r>
-      <w:proofErr w:type="spellEnd"/>
-      <w:r>
-        <w:rPr>
-          <w:color w:val="000000" w:themeColor="text1"/>
-        </w:rPr>
-        <w:t xml:space="preserve"> sign + </w:t>
-      </w:r>
-      <w:proofErr w:type="spellStart"/>
-      <w:r>
-        <w:rPr>
-          <w:color w:val="000000" w:themeColor="text1"/>
-        </w:rPr>
-        <w:t>oubd</w:t>
-      </w:r>
-      <w:proofErr w:type="spellEnd"/>
-      <w:r>
-        <w:rPr>
-          <w:color w:val="000000" w:themeColor="text1"/>
-        </w:rPr>
-        <w:br/>
-      </w:r>
+      </w:pPr>
       <w:bookmarkStart w:id="1" w:name="_GoBack"/>
       <w:bookmarkEnd w:id="1"/>
-      <w:r>
+    </w:p>
+    <w:p>
+      <w:pPr>
+        <w:pStyle w:val="NormalWeb"/>
+        <w:numPr>
+          <w:ilvl w:val="0"/>
+          <w:numId w:val="15"/>
+        </w:numPr>
+        <w:shd w:val="clear" w:color="auto" w:fill="FFFFFF" w:themeFill="background1"/>
         <w:rPr>
           <w:color w:val="000000" w:themeColor="text1"/>
         </w:rPr>
-        <w:t xml:space="preserve">top to bottom  -- &amp; OR -- </w:t>
+      </w:pPr>
+      <w:r>
+        <w:rPr>
+          <w:color w:val="000000" w:themeColor="text1"/>
+        </w:rPr>
+        <w:t xml:space="preserve">when a </w:t>
+      </w:r>
+      <w:r>
+        <w:rPr>
+          <w:color w:val="000000" w:themeColor="text1"/>
+        </w:rPr>
+        <w:t>variety</w:t>
+      </w:r>
+      <w:r>
+        <w:rPr>
+          <w:color w:val="000000" w:themeColor="text1"/>
+        </w:rPr>
+        <w:t xml:space="preserve"> is </w:t>
+      </w:r>
+      <w:r>
+        <w:rPr>
+          <w:color w:val="000000" w:themeColor="text1"/>
+        </w:rPr>
+        <w:t>stock out</w:t>
+      </w:r>
+      <w:r>
+        <w:rPr>
+          <w:color w:val="000000" w:themeColor="text1"/>
+        </w:rPr>
+        <w:t xml:space="preserve"> it will be disabled in frontend</w:t>
+      </w:r>
+    </w:p>
+    <w:p>
+      <w:pPr>
+        <w:pStyle w:val="NormalWeb"/>
+        <w:numPr>
+          <w:ilvl w:val="0"/>
+          <w:numId w:val="15"/>
+        </w:numPr>
+        <w:shd w:val="clear" w:color="auto" w:fill="FFFFFF" w:themeFill="background1"/>
+        <w:rPr>
+          <w:color w:val="000000" w:themeColor="text1"/>
+        </w:rPr>
+      </w:pPr>
+      <w:r>
+        <w:rPr>
+          <w:color w:val="000000" w:themeColor="text1"/>
+        </w:rPr>
+        <w:t xml:space="preserve">product details - click to zoom </w:t>
+      </w:r>
+    </w:p>
+    <w:p>
+      <w:pPr>
+        <w:pStyle w:val="NormalWeb"/>
+        <w:numPr>
+          <w:ilvl w:val="0"/>
+          <w:numId w:val="15"/>
+        </w:numPr>
+        <w:shd w:val="clear" w:color="auto" w:fill="FFFFFF" w:themeFill="background1"/>
+        <w:rPr>
+          <w:color w:val="000000" w:themeColor="text1"/>
+        </w:rPr>
+      </w:pPr>
+      <w:r>
+        <w:rPr>
+          <w:color w:val="000000" w:themeColor="text1"/>
+        </w:rPr>
+        <w:t xml:space="preserve">product details - order on </w:t>
+      </w:r>
+      <w:r>
+        <w:rPr>
+          <w:color w:val="000000" w:themeColor="text1"/>
+        </w:rPr>
+        <w:t>WhatsApp</w:t>
+      </w:r>
+      <w:r>
+        <w:rPr>
+          <w:color w:val="000000" w:themeColor="text1"/>
+        </w:rPr>
+        <w:t xml:space="preserve"> button</w:t>
+      </w:r>
+    </w:p>
+    <w:p>
+      <w:pPr>
+        <w:pStyle w:val="NormalWeb"/>
+        <w:numPr>
+          <w:ilvl w:val="0"/>
+          <w:numId w:val="15"/>
+        </w:numPr>
+        <w:shd w:val="clear" w:color="auto" w:fill="FFFFFF" w:themeFill="background1"/>
+        <w:rPr>
+          <w:color w:val="000000" w:themeColor="text1"/>
+        </w:rPr>
+      </w:pPr>
+      <w:r>
+        <w:rPr>
+          <w:color w:val="000000" w:themeColor="text1"/>
+        </w:rPr>
+        <w:t>Footer -</w:t>
+      </w:r>
+      <w:r>
+        <w:rPr>
+          <w:color w:val="000000" w:themeColor="text1"/>
+        </w:rPr>
+        <w:t xml:space="preserve"> </w:t>
       </w:r>
       <w:proofErr w:type="spellStart"/>
       <w:r>
         <w:rPr>
           <w:color w:val="000000" w:themeColor="text1"/>
         </w:rPr>
-        <w:t>Whatsapp</w:t>
+        <w:t>belivers</w:t>
       </w:r>
       <w:proofErr w:type="spellEnd"/>
+      <w:r>
+        <w:rPr>
+          <w:color w:val="000000" w:themeColor="text1"/>
+        </w:rPr>
+        <w:t xml:space="preserve"> sign + </w:t>
+      </w:r>
+      <w:proofErr w:type="spellStart"/>
+      <w:r>
+        <w:rPr>
+          <w:color w:val="000000" w:themeColor="text1"/>
+        </w:rPr>
+        <w:t>oubd</w:t>
+      </w:r>
+      <w:proofErr w:type="spellEnd"/>
+    </w:p>
+    <w:p>
+      <w:pPr>
+        <w:pStyle w:val="NormalWeb"/>
+        <w:numPr>
+          <w:ilvl w:val="0"/>
+          <w:numId w:val="15"/>
+        </w:numPr>
+        <w:shd w:val="clear" w:color="auto" w:fill="FFFFFF" w:themeFill="background1"/>
+        <w:rPr>
+          <w:color w:val="000000" w:themeColor="text1"/>
+        </w:rPr>
+      </w:pPr>
+      <w:r>
+        <w:rPr>
+          <w:color w:val="000000" w:themeColor="text1"/>
+        </w:rPr>
+        <w:t xml:space="preserve">top to </w:t>
+      </w:r>
+      <w:r>
+        <w:rPr>
+          <w:color w:val="000000" w:themeColor="text1"/>
+        </w:rPr>
+        <w:t>bottom --</w:t>
+      </w:r>
+      <w:r>
+        <w:rPr>
+          <w:color w:val="000000" w:themeColor="text1"/>
+        </w:rPr>
+        <w:t xml:space="preserve"> &amp; OR -- </w:t>
+      </w:r>
+      <w:r>
+        <w:rPr>
+          <w:color w:val="000000" w:themeColor="text1"/>
+        </w:rPr>
+        <w:t>WhatsApp</w:t>
+      </w:r>
       <w:r>
         <w:rPr>
           <w:color w:val="000000" w:themeColor="text1"/>
@@ -15114,7 +15259,7 @@
 </file>
 
 <file path=customXml/itemProps1.xml><?xml version="1.0" encoding="utf-8"?>
-<ds:datastoreItem xmlns:ds="http://schemas.openxmlformats.org/officeDocument/2006/customXml" ds:itemID="{6740484F-0689-4664-9493-8AEA6D99BE77}">
+<ds:datastoreItem xmlns:ds="http://schemas.openxmlformats.org/officeDocument/2006/customXml" ds:itemID="{0EEBC1AB-F529-4AA2-8DEB-AE2A48DDC007}">
   <ds:schemaRefs>
     <ds:schemaRef ds:uri="http://schemas.openxmlformats.org/officeDocument/2006/bibliography"/>
   </ds:schemaRefs>

</xml_diff>